<commit_message>
Laya vs MCTS docx: conclusion as a comparison table, add result charts
Co-Authored-By: Claude Opus 5.5 <noreply@anthropic.com>
Claude-Session: https://claude.ai/code/session_01RobwG4fG7s83Eyb7XAeMFj
</commit_message>
<xml_diff>
--- a/docs/report_laya_vs_mcts.docx
+++ b/docs/report_laya_vs_mcts.docx
@@ -28,6 +28,436 @@
       <w:r>
         <w:t xml:space="preserve">結論</w:t>
       </w:r>
+    </w:p>
+    <w:p>
+      <w:pPr>
+        <w:keepNext/>
+        <w:spacing w:after="120"/>
+      </w:pPr>
+      <w:r>
+        <w:rPr>
+          <w:color w:val="595959"/>
+        </w:rPr>
+        <w:t xml:space="preserve">最難關卡 L3-goal，100 場測試遊戲：</w:t>
+      </w:r>
+    </w:p>
+    <w:tbl>
+      <w:tblPr>
+        <w:tblW w:type="dxa" w:w="9026"/>
+        <w:tblBorders>
+          <w:top w:val="single" w:color="auto" w:sz="4"/>
+          <w:left w:val="single" w:color="auto" w:sz="4"/>
+          <w:bottom w:val="single" w:color="auto" w:sz="4"/>
+          <w:right w:val="single" w:color="auto" w:sz="4"/>
+          <w:insideH w:val="single" w:color="auto" w:sz="4"/>
+          <w:insideV w:val="single" w:color="auto" w:sz="4"/>
+        </w:tblBorders>
+      </w:tblPr>
+      <w:tblGrid>
+        <w:gridCol w:w="4426"/>
+        <w:gridCol w:w="2300"/>
+        <w:gridCol w:w="2300"/>
+      </w:tblGrid>
+      <w:tr>
+        <w:trPr>
+          <w:tblHeader/>
+        </w:trPr>
+        <w:tc>
+          <w:tcPr>
+            <w:tcW w:type="dxa" w:w="4426"/>
+            <w:tcBorders>
+              <w:top w:val="none" w:color="FFFFFF" w:sz="0"/>
+              <w:left w:val="none" w:color="FFFFFF" w:sz="0"/>
+              <w:bottom w:val="single" w:color="404040" w:sz="8"/>
+              <w:right w:val="none" w:color="FFFFFF" w:sz="0"/>
+            </w:tcBorders>
+            <w:shd w:fill="F2F2F2" w:color="auto" w:val="clear"/>
+            <w:tcMar>
+              <w:top w:type="dxa" w:w="60"/>
+              <w:left w:type="dxa" w:w="100"/>
+              <w:bottom w:type="dxa" w:w="60"/>
+              <w:right w:type="dxa" w:w="100"/>
+            </w:tcMar>
+          </w:tcPr>
+          <w:p>
+            <w:pPr>
+              <w:keepNext/>
+              <w:keepLines/>
+              <w:jc w:val="left"/>
+            </w:pPr>
+            <w:r>
+              <w:rPr>
+                <w:b/>
+                <w:bCs/>
+              </w:rPr>
+              <w:t xml:space="preserve">指標</w:t>
+            </w:r>
+          </w:p>
+        </w:tc>
+        <w:tc>
+          <w:tcPr>
+            <w:tcW w:type="dxa" w:w="2300"/>
+            <w:tcBorders>
+              <w:top w:val="none" w:color="FFFFFF" w:sz="0"/>
+              <w:left w:val="none" w:color="FFFFFF" w:sz="0"/>
+              <w:bottom w:val="single" w:color="404040" w:sz="8"/>
+              <w:right w:val="none" w:color="FFFFFF" w:sz="0"/>
+            </w:tcBorders>
+            <w:shd w:fill="F2F2F2" w:color="auto" w:val="clear"/>
+            <w:tcMar>
+              <w:top w:type="dxa" w:w="60"/>
+              <w:left w:type="dxa" w:w="100"/>
+              <w:bottom w:type="dxa" w:w="60"/>
+              <w:right w:type="dxa" w:w="100"/>
+            </w:tcMar>
+          </w:tcPr>
+          <w:p>
+            <w:pPr>
+              <w:keepNext/>
+              <w:keepLines/>
+              <w:jc w:val="right"/>
+            </w:pPr>
+            <w:r>
+              <w:rPr>
+                <w:b/>
+                <w:bCs/>
+              </w:rPr>
+              <w:t xml:space="preserve">MCTS</w:t>
+            </w:r>
+          </w:p>
+        </w:tc>
+        <w:tc>
+          <w:tcPr>
+            <w:tcW w:type="dxa" w:w="2300"/>
+            <w:tcBorders>
+              <w:top w:val="none" w:color="FFFFFF" w:sz="0"/>
+              <w:left w:val="none" w:color="FFFFFF" w:sz="0"/>
+              <w:bottom w:val="single" w:color="404040" w:sz="8"/>
+              <w:right w:val="none" w:color="FFFFFF" w:sz="0"/>
+            </w:tcBorders>
+            <w:shd w:fill="F2F2F2" w:color="auto" w:val="clear"/>
+            <w:tcMar>
+              <w:top w:type="dxa" w:w="60"/>
+              <w:left w:type="dxa" w:w="100"/>
+              <w:bottom w:type="dxa" w:w="60"/>
+              <w:right w:type="dxa" w:w="100"/>
+            </w:tcMar>
+          </w:tcPr>
+          <w:p>
+            <w:pPr>
+              <w:keepNext/>
+              <w:keepLines/>
+              <w:jc w:val="right"/>
+            </w:pPr>
+            <w:r>
+              <w:rPr>
+                <w:b/>
+                <w:bCs/>
+              </w:rPr>
+              <w:t xml:space="preserve">Laya + MCTS</w:t>
+            </w:r>
+          </w:p>
+        </w:tc>
+      </w:tr>
+      <w:tr>
+        <w:trPr>
+          <w:cantSplit/>
+        </w:trPr>
+        <w:tc>
+          <w:tcPr>
+            <w:tcW w:type="dxa" w:w="4426"/>
+            <w:tcBorders>
+              <w:top w:val="none" w:color="FFFFFF" w:sz="0"/>
+              <w:left w:val="none" w:color="FFFFFF" w:sz="0"/>
+              <w:bottom w:val="single" w:color="BFBFBF" w:sz="4"/>
+              <w:right w:val="none" w:color="FFFFFF" w:sz="0"/>
+            </w:tcBorders>
+            <w:tcMar>
+              <w:top w:type="dxa" w:w="60"/>
+              <w:left w:type="dxa" w:w="100"/>
+              <w:bottom w:type="dxa" w:w="60"/>
+              <w:right w:type="dxa" w:w="100"/>
+            </w:tcMar>
+          </w:tcPr>
+          <w:p>
+            <w:pPr>
+              <w:keepNext/>
+              <w:keepLines/>
+              <w:jc w:val="left"/>
+            </w:pPr>
+            <w:r>
+              <w:rPr>
+                <w:b w:val="false"/>
+                <w:bCs w:val="false"/>
+              </w:rPr>
+              <w:t xml:space="preserve">成功率</w:t>
+            </w:r>
+          </w:p>
+        </w:tc>
+        <w:tc>
+          <w:tcPr>
+            <w:tcW w:type="dxa" w:w="2300"/>
+            <w:tcBorders>
+              <w:top w:val="none" w:color="FFFFFF" w:sz="0"/>
+              <w:left w:val="none" w:color="FFFFFF" w:sz="0"/>
+              <w:bottom w:val="single" w:color="BFBFBF" w:sz="4"/>
+              <w:right w:val="none" w:color="FFFFFF" w:sz="0"/>
+            </w:tcBorders>
+            <w:tcMar>
+              <w:top w:type="dxa" w:w="60"/>
+              <w:left w:type="dxa" w:w="100"/>
+              <w:bottom w:type="dxa" w:w="60"/>
+              <w:right w:type="dxa" w:w="100"/>
+            </w:tcMar>
+          </w:tcPr>
+          <w:p>
+            <w:pPr>
+              <w:keepNext/>
+              <w:keepLines/>
+              <w:jc w:val="right"/>
+            </w:pPr>
+            <w:r>
+              <w:rPr>
+                <w:b w:val="false"/>
+                <w:bCs w:val="false"/>
+              </w:rPr>
+              <w:t xml:space="preserve">13%</w:t>
+            </w:r>
+          </w:p>
+        </w:tc>
+        <w:tc>
+          <w:tcPr>
+            <w:tcW w:type="dxa" w:w="2300"/>
+            <w:tcBorders>
+              <w:top w:val="none" w:color="FFFFFF" w:sz="0"/>
+              <w:left w:val="none" w:color="FFFFFF" w:sz="0"/>
+              <w:bottom w:val="single" w:color="BFBFBF" w:sz="4"/>
+              <w:right w:val="none" w:color="FFFFFF" w:sz="0"/>
+            </w:tcBorders>
+            <w:tcMar>
+              <w:top w:type="dxa" w:w="60"/>
+              <w:left w:type="dxa" w:w="100"/>
+              <w:bottom w:type="dxa" w:w="60"/>
+              <w:right w:type="dxa" w:w="100"/>
+            </w:tcMar>
+          </w:tcPr>
+          <w:p>
+            <w:pPr>
+              <w:keepNext/>
+              <w:keepLines/>
+              <w:jc w:val="right"/>
+            </w:pPr>
+            <w:r>
+              <w:rPr>
+                <w:b/>
+                <w:bCs/>
+              </w:rPr>
+              <w:t xml:space="preserve">89%</w:t>
+            </w:r>
+          </w:p>
+        </w:tc>
+      </w:tr>
+      <w:tr>
+        <w:trPr>
+          <w:cantSplit/>
+        </w:trPr>
+        <w:tc>
+          <w:tcPr>
+            <w:tcW w:type="dxa" w:w="4426"/>
+            <w:tcBorders>
+              <w:top w:val="none" w:color="FFFFFF" w:sz="0"/>
+              <w:left w:val="none" w:color="FFFFFF" w:sz="0"/>
+              <w:bottom w:val="single" w:color="BFBFBF" w:sz="4"/>
+              <w:right w:val="none" w:color="FFFFFF" w:sz="0"/>
+            </w:tcBorders>
+            <w:tcMar>
+              <w:top w:type="dxa" w:w="60"/>
+              <w:left w:type="dxa" w:w="100"/>
+              <w:bottom w:type="dxa" w:w="60"/>
+              <w:right w:type="dxa" w:w="100"/>
+            </w:tcMar>
+          </w:tcPr>
+          <w:p>
+            <w:pPr>
+              <w:keepNext/>
+              <w:keepLines/>
+              <w:jc w:val="left"/>
+            </w:pPr>
+            <w:r>
+              <w:rPr>
+                <w:b w:val="false"/>
+                <w:bCs w:val="false"/>
+              </w:rPr>
+              <w:t xml:space="preserve">每場平均步數（上限 30）</w:t>
+            </w:r>
+          </w:p>
+        </w:tc>
+        <w:tc>
+          <w:tcPr>
+            <w:tcW w:type="dxa" w:w="2300"/>
+            <w:tcBorders>
+              <w:top w:val="none" w:color="FFFFFF" w:sz="0"/>
+              <w:left w:val="none" w:color="FFFFFF" w:sz="0"/>
+              <w:bottom w:val="single" w:color="BFBFBF" w:sz="4"/>
+              <w:right w:val="none" w:color="FFFFFF" w:sz="0"/>
+            </w:tcBorders>
+            <w:tcMar>
+              <w:top w:type="dxa" w:w="60"/>
+              <w:left w:type="dxa" w:w="100"/>
+              <w:bottom w:type="dxa" w:w="60"/>
+              <w:right w:type="dxa" w:w="100"/>
+            </w:tcMar>
+          </w:tcPr>
+          <w:p>
+            <w:pPr>
+              <w:keepNext/>
+              <w:keepLines/>
+              <w:jc w:val="right"/>
+            </w:pPr>
+            <w:r>
+              <w:rPr>
+                <w:b w:val="false"/>
+                <w:bCs w:val="false"/>
+              </w:rPr>
+              <w:t xml:space="preserve">≈ 27.4</w:t>
+            </w:r>
+          </w:p>
+        </w:tc>
+        <w:tc>
+          <w:tcPr>
+            <w:tcW w:type="dxa" w:w="2300"/>
+            <w:tcBorders>
+              <w:top w:val="none" w:color="FFFFFF" w:sz="0"/>
+              <w:left w:val="none" w:color="FFFFFF" w:sz="0"/>
+              <w:bottom w:val="single" w:color="BFBFBF" w:sz="4"/>
+              <w:right w:val="none" w:color="FFFFFF" w:sz="0"/>
+            </w:tcBorders>
+            <w:tcMar>
+              <w:top w:type="dxa" w:w="60"/>
+              <w:left w:type="dxa" w:w="100"/>
+              <w:bottom w:type="dxa" w:w="60"/>
+              <w:right w:type="dxa" w:w="100"/>
+            </w:tcMar>
+          </w:tcPr>
+          <w:p>
+            <w:pPr>
+              <w:keepNext/>
+              <w:keepLines/>
+              <w:jc w:val="right"/>
+            </w:pPr>
+            <w:r>
+              <w:rPr>
+                <w:b/>
+                <w:bCs/>
+              </w:rPr>
+              <w:t xml:space="preserve">11.0</w:t>
+            </w:r>
+          </w:p>
+        </w:tc>
+      </w:tr>
+      <w:tr>
+        <w:trPr>
+          <w:cantSplit/>
+        </w:trPr>
+        <w:tc>
+          <w:tcPr>
+            <w:tcW w:type="dxa" w:w="4426"/>
+            <w:tcBorders>
+              <w:top w:val="none" w:color="FFFFFF" w:sz="0"/>
+              <w:left w:val="none" w:color="FFFFFF" w:sz="0"/>
+              <w:bottom w:val="single" w:color="BFBFBF" w:sz="4"/>
+              <w:right w:val="none" w:color="FFFFFF" w:sz="0"/>
+            </w:tcBorders>
+            <w:tcMar>
+              <w:top w:type="dxa" w:w="60"/>
+              <w:left w:type="dxa" w:w="100"/>
+              <w:bottom w:type="dxa" w:w="60"/>
+              <w:right w:type="dxa" w:w="100"/>
+            </w:tcMar>
+          </w:tcPr>
+          <w:p>
+            <w:pPr>
+              <w:keepNext w:val="false"/>
+              <w:keepLines/>
+              <w:jc w:val="left"/>
+            </w:pPr>
+            <w:r>
+              <w:rPr>
+                <w:b w:val="false"/>
+                <w:bCs w:val="false"/>
+              </w:rPr>
+              <w:t xml:space="preserve">成功的場次平均步數（最少 8）</w:t>
+            </w:r>
+          </w:p>
+        </w:tc>
+        <w:tc>
+          <w:tcPr>
+            <w:tcW w:type="dxa" w:w="2300"/>
+            <w:tcBorders>
+              <w:top w:val="none" w:color="FFFFFF" w:sz="0"/>
+              <w:left w:val="none" w:color="FFFFFF" w:sz="0"/>
+              <w:bottom w:val="single" w:color="BFBFBF" w:sz="4"/>
+              <w:right w:val="none" w:color="FFFFFF" w:sz="0"/>
+            </w:tcBorders>
+            <w:tcMar>
+              <w:top w:type="dxa" w:w="60"/>
+              <w:left w:type="dxa" w:w="100"/>
+              <w:bottom w:type="dxa" w:w="60"/>
+              <w:right w:type="dxa" w:w="100"/>
+            </w:tcMar>
+          </w:tcPr>
+          <w:p>
+            <w:pPr>
+              <w:keepNext w:val="false"/>
+              <w:keepLines/>
+              <w:jc w:val="right"/>
+            </w:pPr>
+            <w:r>
+              <w:rPr>
+                <w:b w:val="false"/>
+                <w:bCs w:val="false"/>
+              </w:rPr>
+              <w:t xml:space="preserve">10.2</w:t>
+            </w:r>
+          </w:p>
+        </w:tc>
+        <w:tc>
+          <w:tcPr>
+            <w:tcW w:type="dxa" w:w="2300"/>
+            <w:tcBorders>
+              <w:top w:val="none" w:color="FFFFFF" w:sz="0"/>
+              <w:left w:val="none" w:color="FFFFFF" w:sz="0"/>
+              <w:bottom w:val="single" w:color="BFBFBF" w:sz="4"/>
+              <w:right w:val="none" w:color="FFFFFF" w:sz="0"/>
+            </w:tcBorders>
+            <w:tcMar>
+              <w:top w:type="dxa" w:w="60"/>
+              <w:left w:type="dxa" w:w="100"/>
+              <w:bottom w:type="dxa" w:w="60"/>
+              <w:right w:type="dxa" w:w="100"/>
+            </w:tcMar>
+          </w:tcPr>
+          <w:p>
+            <w:pPr>
+              <w:keepNext w:val="false"/>
+              <w:keepLines/>
+              <w:jc w:val="right"/>
+            </w:pPr>
+            <w:r>
+              <w:rPr>
+                <w:b/>
+                <w:bCs/>
+              </w:rPr>
+              <w:t xml:space="preserve">8.6</w:t>
+            </w:r>
+          </w:p>
+        </w:tc>
+      </w:tr>
+    </w:tbl>
+    <w:p>
+      <w:pPr>
+        <w:spacing w:after="60"/>
+      </w:pPr>
     </w:p>
     <w:p>
       <w:pPr>
@@ -39,40 +469,7 @@
         <w:spacing w:after="60"/>
       </w:pPr>
       <w:r>
-        <w:t xml:space="preserve">在最難的關卡 L3-goal，成功率從 </w:t>
-      </w:r>
-      <w:r>
-        <w:rPr>
-          <w:b/>
-          <w:bCs/>
-        </w:rPr>
-        <w:t xml:space="preserve">13%</w:t>
-      </w:r>
-      <w:r>
-        <w:t xml:space="preserve"> 提高到 </w:t>
-      </w:r>
-      <w:r>
-        <w:rPr>
-          <w:b/>
-          <w:bCs/>
-        </w:rPr>
-        <w:t xml:space="preserve">89%</w:t>
-      </w:r>
-      <w:r>
-        <w:t xml:space="preserve">。</w:t>
-      </w:r>
-    </w:p>
-    <w:p>
-      <w:pPr>
-        <w:pStyle w:val="ListParagraph"/>
-        <w:numPr>
-          <w:ilvl w:val="0"/>
-          <w:numId w:val="2"/>
-        </w:numPr>
-        <w:spacing w:after="60"/>
-      </w:pPr>
-      <w:r>
-        <w:t xml:space="preserve">成功的場次平均 8.6 步，接近任務最少的 8 步；MCTS 要 10.2 步。</w:t>
+        <w:t xml:space="preserve">加上 Laya，解得更多也更快。</w:t>
       </w:r>
     </w:p>
     <w:p>
@@ -144,6 +541,8 @@
           </w:tcPr>
           <w:p>
             <w:pPr>
+              <w:keepNext/>
+              <w:keepLines/>
               <w:jc w:val="left"/>
             </w:pPr>
             <w:r>
@@ -174,6 +573,8 @@
           </w:tcPr>
           <w:p>
             <w:pPr>
+              <w:keepNext/>
+              <w:keepLines/>
               <w:jc w:val="left"/>
             </w:pPr>
             <w:r>
@@ -204,6 +605,8 @@
           </w:tcPr>
           <w:p>
             <w:pPr>
+              <w:keepNext/>
+              <w:keepLines/>
               <w:jc w:val="left"/>
             </w:pPr>
             <w:r>
@@ -217,6 +620,9 @@
         </w:tc>
       </w:tr>
       <w:tr>
+        <w:trPr>
+          <w:cantSplit/>
+        </w:trPr>
         <w:tc>
           <w:tcPr>
             <w:tcW w:type="dxa" w:w="2026"/>
@@ -235,9 +641,15 @@
           </w:tcPr>
           <w:p>
             <w:pPr>
-              <w:jc w:val="left"/>
-            </w:pPr>
-            <w:r>
+              <w:keepNext/>
+              <w:keepLines/>
+              <w:jc w:val="left"/>
+            </w:pPr>
+            <w:r>
+              <w:rPr>
+                <w:b w:val="false"/>
+                <w:bCs w:val="false"/>
+              </w:rPr>
               <w:t xml:space="preserve">先試哪一步</w:t>
             </w:r>
           </w:p>
@@ -260,9 +672,15 @@
           </w:tcPr>
           <w:p>
             <w:pPr>
-              <w:jc w:val="left"/>
-            </w:pPr>
-            <w:r>
+              <w:keepNext/>
+              <w:keepLines/>
+              <w:jc w:val="left"/>
+            </w:pPr>
+            <w:r>
+              <w:rPr>
+                <w:b w:val="false"/>
+                <w:bCs w:val="false"/>
+              </w:rPr>
               <w:t xml:space="preserve">每個動作機會均等</w:t>
             </w:r>
           </w:p>
@@ -285,15 +703,24 @@
           </w:tcPr>
           <w:p>
             <w:pPr>
-              <w:jc w:val="left"/>
-            </w:pPr>
-            <w:r>
+              <w:keepNext/>
+              <w:keepLines/>
+              <w:jc w:val="left"/>
+            </w:pPr>
+            <w:r>
+              <w:rPr>
+                <w:b w:val="false"/>
+                <w:bCs w:val="false"/>
+              </w:rPr>
               <w:t xml:space="preserve">Laya 給每個動作一個機率，高的先試</w:t>
             </w:r>
           </w:p>
         </w:tc>
       </w:tr>
       <w:tr>
+        <w:trPr>
+          <w:cantSplit/>
+        </w:trPr>
         <w:tc>
           <w:tcPr>
             <w:tcW w:type="dxa" w:w="2026"/>
@@ -312,9 +739,15 @@
           </w:tcPr>
           <w:p>
             <w:pPr>
-              <w:jc w:val="left"/>
-            </w:pPr>
-            <w:r>
+              <w:keepNext/>
+              <w:keepLines/>
+              <w:jc w:val="left"/>
+            </w:pPr>
+            <w:r>
+              <w:rPr>
+                <w:b w:val="false"/>
+                <w:bCs w:val="false"/>
+              </w:rPr>
               <w:t xml:space="preserve">這一步好不好</w:t>
             </w:r>
           </w:p>
@@ -337,9 +770,15 @@
           </w:tcPr>
           <w:p>
             <w:pPr>
-              <w:jc w:val="left"/>
-            </w:pPr>
-            <w:r>
+              <w:keepNext/>
+              <w:keepLines/>
+              <w:jc w:val="left"/>
+            </w:pPr>
+            <w:r>
+              <w:rPr>
+                <w:b w:val="false"/>
+                <w:bCs w:val="false"/>
+              </w:rPr>
               <w:t xml:space="preserve">隨機亂走到遊戲結束，看成敗</w:t>
             </w:r>
           </w:p>
@@ -362,15 +801,24 @@
           </w:tcPr>
           <w:p>
             <w:pPr>
-              <w:jc w:val="left"/>
-            </w:pPr>
-            <w:r>
+              <w:keepNext/>
+              <w:keepLines/>
+              <w:jc w:val="left"/>
+            </w:pPr>
+            <w:r>
+              <w:rPr>
+                <w:b w:val="false"/>
+                <w:bCs w:val="false"/>
+              </w:rPr>
               <w:t xml:space="preserve">Laya 估計照這樣下去會不會成功</w:t>
             </w:r>
           </w:p>
         </w:tc>
       </w:tr>
       <w:tr>
+        <w:trPr>
+          <w:cantSplit/>
+        </w:trPr>
         <w:tc>
           <w:tcPr>
             <w:tcW w:type="dxa" w:w="2026"/>
@@ -389,9 +837,15 @@
           </w:tcPr>
           <w:p>
             <w:pPr>
-              <w:jc w:val="left"/>
-            </w:pPr>
-            <w:r>
+              <w:keepNext w:val="false"/>
+              <w:keepLines/>
+              <w:jc w:val="left"/>
+            </w:pPr>
+            <w:r>
+              <w:rPr>
+                <w:b w:val="false"/>
+                <w:bCs w:val="false"/>
+              </w:rPr>
               <w:t xml:space="preserve">需要訓練</w:t>
             </w:r>
           </w:p>
@@ -414,9 +868,15 @@
           </w:tcPr>
           <w:p>
             <w:pPr>
-              <w:jc w:val="left"/>
-            </w:pPr>
-            <w:r>
+              <w:keepNext w:val="false"/>
+              <w:keepLines/>
+              <w:jc w:val="left"/>
+            </w:pPr>
+            <w:r>
+              <w:rPr>
+                <w:b w:val="false"/>
+                <w:bCs w:val="false"/>
+              </w:rPr>
               <w:t xml:space="preserve">不用</w:t>
             </w:r>
           </w:p>
@@ -439,9 +899,15 @@
           </w:tcPr>
           <w:p>
             <w:pPr>
-              <w:jc w:val="left"/>
-            </w:pPr>
-            <w:r>
+              <w:keepNext w:val="false"/>
+              <w:keepLines/>
+              <w:jc w:val="left"/>
+            </w:pPr>
+            <w:r>
+              <w:rPr>
+                <w:b w:val="false"/>
+                <w:bCs w:val="false"/>
+              </w:rPr>
               <w:t xml:space="preserve">要</w:t>
             </w:r>
           </w:p>
@@ -529,6 +995,8 @@
           </w:tcPr>
           <w:p>
             <w:pPr>
+              <w:keepNext/>
+              <w:keepLines/>
               <w:jc w:val="left"/>
             </w:pPr>
             <w:r>
@@ -559,6 +1027,8 @@
           </w:tcPr>
           <w:p>
             <w:pPr>
+              <w:keepNext/>
+              <w:keepLines/>
               <w:jc w:val="right"/>
             </w:pPr>
             <w:r>
@@ -589,6 +1059,8 @@
           </w:tcPr>
           <w:p>
             <w:pPr>
+              <w:keepNext/>
+              <w:keepLines/>
               <w:jc w:val="right"/>
             </w:pPr>
             <w:r>
@@ -619,6 +1091,8 @@
           </w:tcPr>
           <w:p>
             <w:pPr>
+              <w:keepNext/>
+              <w:keepLines/>
               <w:jc w:val="right"/>
             </w:pPr>
             <w:r>
@@ -649,6 +1123,8 @@
           </w:tcPr>
           <w:p>
             <w:pPr>
+              <w:keepNext/>
+              <w:keepLines/>
               <w:jc w:val="right"/>
             </w:pPr>
             <w:r>
@@ -662,6 +1138,9 @@
         </w:tc>
       </w:tr>
       <w:tr>
+        <w:trPr>
+          <w:cantSplit/>
+        </w:trPr>
         <w:tc>
           <w:tcPr>
             <w:tcW w:type="dxa" w:w="2626"/>
@@ -680,9 +1159,15 @@
           </w:tcPr>
           <w:p>
             <w:pPr>
-              <w:jc w:val="left"/>
-            </w:pPr>
-            <w:r>
+              <w:keepNext/>
+              <w:keepLines/>
+              <w:jc w:val="left"/>
+            </w:pPr>
+            <w:r>
+              <w:rPr>
+                <w:b w:val="false"/>
+                <w:bCs w:val="false"/>
+              </w:rPr>
               <w:t xml:space="preserve">L2-goal</w:t>
             </w:r>
           </w:p>
@@ -705,9 +1190,15 @@
           </w:tcPr>
           <w:p>
             <w:pPr>
-              <w:jc w:val="right"/>
-            </w:pPr>
-            <w:r>
+              <w:keepNext/>
+              <w:keepLines/>
+              <w:jc w:val="right"/>
+            </w:pPr>
+            <w:r>
+              <w:rPr>
+                <w:b w:val="false"/>
+                <w:bCs w:val="false"/>
+              </w:rPr>
               <w:t xml:space="preserve">5</w:t>
             </w:r>
           </w:p>
@@ -730,9 +1221,15 @@
           </w:tcPr>
           <w:p>
             <w:pPr>
-              <w:jc w:val="right"/>
-            </w:pPr>
-            <w:r>
+              <w:keepNext/>
+              <w:keepLines/>
+              <w:jc w:val="right"/>
+            </w:pPr>
+            <w:r>
+              <w:rPr>
+                <w:b w:val="false"/>
+                <w:bCs w:val="false"/>
+              </w:rPr>
               <w:t xml:space="preserve">10</w:t>
             </w:r>
           </w:p>
@@ -755,9 +1252,15 @@
           </w:tcPr>
           <w:p>
             <w:pPr>
-              <w:jc w:val="right"/>
-            </w:pPr>
-            <w:r>
+              <w:keepNext/>
+              <w:keepLines/>
+              <w:jc w:val="right"/>
+            </w:pPr>
+            <w:r>
+              <w:rPr>
+                <w:b w:val="false"/>
+                <w:bCs w:val="false"/>
+              </w:rPr>
               <w:t xml:space="preserve">5</w:t>
             </w:r>
           </w:p>
@@ -780,15 +1283,24 @@
           </w:tcPr>
           <w:p>
             <w:pPr>
-              <w:jc w:val="right"/>
-            </w:pPr>
-            <w:r>
+              <w:keepNext/>
+              <w:keepLines/>
+              <w:jc w:val="right"/>
+            </w:pPr>
+            <w:r>
+              <w:rPr>
+                <w:b w:val="false"/>
+                <w:bCs w:val="false"/>
+              </w:rPr>
               <w:t xml:space="preserve">20</w:t>
             </w:r>
           </w:p>
         </w:tc>
       </w:tr>
       <w:tr>
+        <w:trPr>
+          <w:cantSplit/>
+        </w:trPr>
         <w:tc>
           <w:tcPr>
             <w:tcW w:type="dxa" w:w="2626"/>
@@ -807,9 +1319,15 @@
           </w:tcPr>
           <w:p>
             <w:pPr>
-              <w:jc w:val="left"/>
-            </w:pPr>
-            <w:r>
+              <w:keepNext w:val="false"/>
+              <w:keepLines/>
+              <w:jc w:val="left"/>
+            </w:pPr>
+            <w:r>
+              <w:rPr>
+                <w:b w:val="false"/>
+                <w:bCs w:val="false"/>
+              </w:rPr>
               <w:t xml:space="preserve">L3-goal（較難）</w:t>
             </w:r>
           </w:p>
@@ -832,9 +1350,15 @@
           </w:tcPr>
           <w:p>
             <w:pPr>
-              <w:jc w:val="right"/>
-            </w:pPr>
-            <w:r>
+              <w:keepNext w:val="false"/>
+              <w:keepLines/>
+              <w:jc w:val="right"/>
+            </w:pPr>
+            <w:r>
+              <w:rPr>
+                <w:b w:val="false"/>
+                <w:bCs w:val="false"/>
+              </w:rPr>
               <w:t xml:space="preserve">8</w:t>
             </w:r>
           </w:p>
@@ -857,9 +1381,15 @@
           </w:tcPr>
           <w:p>
             <w:pPr>
-              <w:jc w:val="right"/>
-            </w:pPr>
-            <w:r>
+              <w:keepNext w:val="false"/>
+              <w:keepLines/>
+              <w:jc w:val="right"/>
+            </w:pPr>
+            <w:r>
+              <w:rPr>
+                <w:b w:val="false"/>
+                <w:bCs w:val="false"/>
+              </w:rPr>
               <w:t xml:space="preserve">15</w:t>
             </w:r>
           </w:p>
@@ -882,9 +1412,15 @@
           </w:tcPr>
           <w:p>
             <w:pPr>
-              <w:jc w:val="right"/>
-            </w:pPr>
-            <w:r>
+              <w:keepNext w:val="false"/>
+              <w:keepLines/>
+              <w:jc w:val="right"/>
+            </w:pPr>
+            <w:r>
+              <w:rPr>
+                <w:b w:val="false"/>
+                <w:bCs w:val="false"/>
+              </w:rPr>
               <w:t xml:space="preserve">8</w:t>
             </w:r>
           </w:p>
@@ -907,9 +1443,15 @@
           </w:tcPr>
           <w:p>
             <w:pPr>
-              <w:jc w:val="right"/>
-            </w:pPr>
-            <w:r>
+              <w:keepNext w:val="false"/>
+              <w:keepLines/>
+              <w:jc w:val="right"/>
+            </w:pPr>
+            <w:r>
+              <w:rPr>
+                <w:b w:val="false"/>
+                <w:bCs w:val="false"/>
+              </w:rPr>
               <w:t xml:space="preserve">30</w:t>
             </w:r>
           </w:p>
@@ -926,6 +1468,7 @@
     </w:p>
     <w:p>
       <w:pPr>
+        <w:keepNext/>
         <w:spacing w:after="120"/>
       </w:pPr>
       <w:r>
@@ -933,6 +1476,144 @@
           <w:color w:val="595959"/>
         </w:rPr>
         <w:t xml:space="preserve">各 100 場訓練時沒看過的遊戲。</w:t>
+      </w:r>
+    </w:p>
+    <w:p>
+      <w:pPr>
+        <w:keepNext w:val="false"/>
+        <w:spacing w:after="120" w:before="120" w:line="240" w:lineRule="auto"/>
+      </w:pPr>
+      <w:r>
+        <w:drawing>
+          <wp:inline distT="0" distB="0" distL="0" distR="0">
+            <wp:extent cx="4343400" cy="1914525"/>
+            <wp:effectExtent t="0" r="0" b="0" l="0"/>
+            <wp:docPr id="1" name="成功率長條圖：L2-goal MCTS 34%、Laya + MCTS 94%；L3-goal 13%、89%" descr="成功率長條圖：L2-goal MCTS 34%、Laya + MCTS 94%；L3-goal 13%、89%" title="成功率長條圖：L2-goal MCTS 34%、Laya + MCTS 94%；L3-goal 13%、89%"/>
+            <wp:cNvGraphicFramePr>
+              <a:graphicFrameLocks xmlns:a="http://schemas.openxmlformats.org/drawingml/2006/main" noChangeAspect="1"/>
+            </wp:cNvGraphicFramePr>
+            <a:graphic xmlns:a="http://schemas.openxmlformats.org/drawingml/2006/main">
+              <a:graphicData uri="http://schemas.openxmlformats.org/drawingml/2006/picture">
+                <pic:pic xmlns:pic="http://schemas.openxmlformats.org/drawingml/2006/picture">
+                  <pic:nvPicPr>
+                    <pic:cNvPr id="0" name="" descr=""/>
+                    <pic:cNvPicPr>
+                      <a:picLocks noChangeAspect="1" noChangeArrowheads="1"/>
+                    </pic:cNvPicPr>
+                  </pic:nvPicPr>
+                  <pic:blipFill>
+                    <a:blip r:embed="rId7" cstate="none"/>
+                    <a:srcRect/>
+                    <a:stretch>
+                      <a:fillRect/>
+                    </a:stretch>
+                  </pic:blipFill>
+                  <pic:spPr bwMode="auto">
+                    <a:xfrm>
+                      <a:off x="0" y="0"/>
+                      <a:ext cx="4343400" cy="1914525"/>
+                    </a:xfrm>
+                    <a:prstGeom prst="rect">
+                      <a:avLst/>
+                    </a:prstGeom>
+                  </pic:spPr>
+                </pic:pic>
+              </a:graphicData>
+            </a:graphic>
+          </wp:inline>
+        </w:drawing>
+      </w:r>
+    </w:p>
+    <w:p>
+      <w:pPr>
+        <w:keepNext w:val="false"/>
+        <w:spacing w:after="120" w:before="120" w:line="240" w:lineRule="auto"/>
+      </w:pPr>
+      <w:r>
+        <w:drawing>
+          <wp:inline distT="0" distB="0" distL="0" distR="0">
+            <wp:extent cx="4343400" cy="1914525"/>
+            <wp:effectExtent t="0" r="0" b="0" l="0"/>
+            <wp:docPr id="1" name="每場平均步數長條圖：L2-goal 16.6 對 6.5；L3-goal 27.4 對 11.0" descr="每場平均步數長條圖：L2-goal 16.6 對 6.5；L3-goal 27.4 對 11.0" title="每場平均步數長條圖：L2-goal 16.6 對 6.5；L3-goal 27.4 對 11.0"/>
+            <wp:cNvGraphicFramePr>
+              <a:graphicFrameLocks xmlns:a="http://schemas.openxmlformats.org/drawingml/2006/main" noChangeAspect="1"/>
+            </wp:cNvGraphicFramePr>
+            <a:graphic xmlns:a="http://schemas.openxmlformats.org/drawingml/2006/main">
+              <a:graphicData uri="http://schemas.openxmlformats.org/drawingml/2006/picture">
+                <pic:pic xmlns:pic="http://schemas.openxmlformats.org/drawingml/2006/picture">
+                  <pic:nvPicPr>
+                    <pic:cNvPr id="0" name="" descr=""/>
+                    <pic:cNvPicPr>
+                      <a:picLocks noChangeAspect="1" noChangeArrowheads="1"/>
+                    </pic:cNvPicPr>
+                  </pic:nvPicPr>
+                  <pic:blipFill>
+                    <a:blip r:embed="rId8" cstate="none"/>
+                    <a:srcRect/>
+                    <a:stretch>
+                      <a:fillRect/>
+                    </a:stretch>
+                  </pic:blipFill>
+                  <pic:spPr bwMode="auto">
+                    <a:xfrm>
+                      <a:off x="0" y="0"/>
+                      <a:ext cx="4343400" cy="1914525"/>
+                    </a:xfrm>
+                    <a:prstGeom prst="rect">
+                      <a:avLst/>
+                    </a:prstGeom>
+                  </pic:spPr>
+                </pic:pic>
+              </a:graphicData>
+            </a:graphic>
+          </wp:inline>
+        </w:drawing>
+      </w:r>
+    </w:p>
+    <w:p>
+      <w:pPr>
+        <w:keepNext w:val="false"/>
+        <w:spacing w:after="120" w:before="120" w:line="240" w:lineRule="auto"/>
+      </w:pPr>
+      <w:r>
+        <w:drawing>
+          <wp:inline distT="0" distB="0" distL="0" distR="0">
+            <wp:extent cx="4343400" cy="1914525"/>
+            <wp:effectExtent t="0" r="0" b="0" l="0"/>
+            <wp:docPr id="1" name="成功的場次平均步數長條圖：L2-goal 9.9 對 5.6（最少 5）；L3-goal 10.2 對 8.6（最少 8）" descr="成功的場次平均步數長條圖：L2-goal 9.9 對 5.6（最少 5）；L3-goal 10.2 對 8.6（最少 8）" title="成功的場次平均步數長條圖：L2-goal 9.9 對 5.6（最少 5）；L3-goal 10.2 對 8.6（最少 8）"/>
+            <wp:cNvGraphicFramePr>
+              <a:graphicFrameLocks xmlns:a="http://schemas.openxmlformats.org/drawingml/2006/main" noChangeAspect="1"/>
+            </wp:cNvGraphicFramePr>
+            <a:graphic xmlns:a="http://schemas.openxmlformats.org/drawingml/2006/main">
+              <a:graphicData uri="http://schemas.openxmlformats.org/drawingml/2006/picture">
+                <pic:pic xmlns:pic="http://schemas.openxmlformats.org/drawingml/2006/picture">
+                  <pic:nvPicPr>
+                    <pic:cNvPr id="0" name="" descr=""/>
+                    <pic:cNvPicPr>
+                      <a:picLocks noChangeAspect="1" noChangeArrowheads="1"/>
+                    </pic:cNvPicPr>
+                  </pic:nvPicPr>
+                  <pic:blipFill>
+                    <a:blip r:embed="rId9" cstate="none"/>
+                    <a:srcRect/>
+                    <a:stretch>
+                      <a:fillRect/>
+                    </a:stretch>
+                  </pic:blipFill>
+                  <pic:spPr bwMode="auto">
+                    <a:xfrm>
+                      <a:off x="0" y="0"/>
+                      <a:ext cx="4343400" cy="1914525"/>
+                    </a:xfrm>
+                    <a:prstGeom prst="rect">
+                      <a:avLst/>
+                    </a:prstGeom>
+                  </pic:spPr>
+                </pic:pic>
+              </a:graphicData>
+            </a:graphic>
+          </wp:inline>
+        </w:drawing>
       </w:r>
     </w:p>
     <w:tbl>
@@ -977,6 +1658,8 @@
           </w:tcPr>
           <w:p>
             <w:pPr>
+              <w:keepNext/>
+              <w:keepLines/>
               <w:jc w:val="left"/>
             </w:pPr>
             <w:r>
@@ -1007,6 +1690,8 @@
           </w:tcPr>
           <w:p>
             <w:pPr>
+              <w:keepNext/>
+              <w:keepLines/>
               <w:jc w:val="right"/>
             </w:pPr>
             <w:r>
@@ -1037,6 +1722,8 @@
           </w:tcPr>
           <w:p>
             <w:pPr>
+              <w:keepNext/>
+              <w:keepLines/>
               <w:jc w:val="right"/>
             </w:pPr>
             <w:r>
@@ -1067,6 +1754,8 @@
           </w:tcPr>
           <w:p>
             <w:pPr>
+              <w:keepNext/>
+              <w:keepLines/>
               <w:jc w:val="right"/>
             </w:pPr>
             <w:r>
@@ -1097,6 +1786,8 @@
           </w:tcPr>
           <w:p>
             <w:pPr>
+              <w:keepNext/>
+              <w:keepLines/>
               <w:jc w:val="right"/>
             </w:pPr>
             <w:r>
@@ -1110,6 +1801,9 @@
         </w:tc>
       </w:tr>
       <w:tr>
+        <w:trPr>
+          <w:cantSplit/>
+        </w:trPr>
         <w:tc>
           <w:tcPr>
             <w:tcW w:type="dxa" w:w="2826"/>
@@ -1128,9 +1822,15 @@
           </w:tcPr>
           <w:p>
             <w:pPr>
-              <w:jc w:val="left"/>
-            </w:pPr>
-            <w:r>
+              <w:keepNext/>
+              <w:keepLines/>
+              <w:jc w:val="left"/>
+            </w:pPr>
+            <w:r>
+              <w:rPr>
+                <w:b w:val="false"/>
+                <w:bCs w:val="false"/>
+              </w:rPr>
               <w:t xml:space="preserve">L2-goal　MCTS</w:t>
             </w:r>
           </w:p>
@@ -1153,9 +1853,15 @@
           </w:tcPr>
           <w:p>
             <w:pPr>
-              <w:jc w:val="right"/>
-            </w:pPr>
-            <w:r>
+              <w:keepNext/>
+              <w:keepLines/>
+              <w:jc w:val="right"/>
+            </w:pPr>
+            <w:r>
+              <w:rPr>
+                <w:b w:val="false"/>
+                <w:bCs w:val="false"/>
+              </w:rPr>
               <w:t xml:space="preserve">34%</w:t>
             </w:r>
           </w:p>
@@ -1178,9 +1884,15 @@
           </w:tcPr>
           <w:p>
             <w:pPr>
-              <w:jc w:val="right"/>
-            </w:pPr>
-            <w:r>
+              <w:keepNext/>
+              <w:keepLines/>
+              <w:jc w:val="right"/>
+            </w:pPr>
+            <w:r>
+              <w:rPr>
+                <w:b w:val="false"/>
+                <w:bCs w:val="false"/>
+              </w:rPr>
               <w:t xml:space="preserve">0.233</w:t>
             </w:r>
           </w:p>
@@ -1203,9 +1915,15 @@
           </w:tcPr>
           <w:p>
             <w:pPr>
-              <w:jc w:val="right"/>
-            </w:pPr>
-            <w:r>
+              <w:keepNext/>
+              <w:keepLines/>
+              <w:jc w:val="right"/>
+            </w:pPr>
+            <w:r>
+              <w:rPr>
+                <w:b w:val="false"/>
+                <w:bCs w:val="false"/>
+              </w:rPr>
               <w:t xml:space="preserve">≈ 16.6</w:t>
             </w:r>
           </w:p>
@@ -1228,15 +1946,24 @@
           </w:tcPr>
           <w:p>
             <w:pPr>
-              <w:jc w:val="right"/>
-            </w:pPr>
-            <w:r>
+              <w:keepNext/>
+              <w:keepLines/>
+              <w:jc w:val="right"/>
+            </w:pPr>
+            <w:r>
+              <w:rPr>
+                <w:b w:val="false"/>
+                <w:bCs w:val="false"/>
+              </w:rPr>
               <w:t xml:space="preserve">9.9</w:t>
             </w:r>
           </w:p>
         </w:tc>
       </w:tr>
       <w:tr>
+        <w:trPr>
+          <w:cantSplit/>
+        </w:trPr>
         <w:tc>
           <w:tcPr>
             <w:tcW w:type="dxa" w:w="2826"/>
@@ -1255,6 +1982,8 @@
           </w:tcPr>
           <w:p>
             <w:pPr>
+              <w:keepNext/>
+              <w:keepLines/>
               <w:jc w:val="left"/>
             </w:pPr>
             <w:r>
@@ -1284,6 +2013,8 @@
           </w:tcPr>
           <w:p>
             <w:pPr>
+              <w:keepNext/>
+              <w:keepLines/>
               <w:jc w:val="right"/>
             </w:pPr>
             <w:r>
@@ -1313,6 +2044,8 @@
           </w:tcPr>
           <w:p>
             <w:pPr>
+              <w:keepNext/>
+              <w:keepLines/>
               <w:jc w:val="right"/>
             </w:pPr>
             <w:r>
@@ -1342,6 +2075,8 @@
           </w:tcPr>
           <w:p>
             <w:pPr>
+              <w:keepNext/>
+              <w:keepLines/>
               <w:jc w:val="right"/>
             </w:pPr>
             <w:r>
@@ -1371,6 +2106,8 @@
           </w:tcPr>
           <w:p>
             <w:pPr>
+              <w:keepNext/>
+              <w:keepLines/>
               <w:jc w:val="right"/>
             </w:pPr>
             <w:r>
@@ -1384,6 +2121,9 @@
         </w:tc>
       </w:tr>
       <w:tr>
+        <w:trPr>
+          <w:cantSplit/>
+        </w:trPr>
         <w:tc>
           <w:tcPr>
             <w:tcW w:type="dxa" w:w="2826"/>
@@ -1402,9 +2142,15 @@
           </w:tcPr>
           <w:p>
             <w:pPr>
-              <w:jc w:val="left"/>
-            </w:pPr>
-            <w:r>
+              <w:keepNext/>
+              <w:keepLines/>
+              <w:jc w:val="left"/>
+            </w:pPr>
+            <w:r>
+              <w:rPr>
+                <w:b w:val="false"/>
+                <w:bCs w:val="false"/>
+              </w:rPr>
               <w:t xml:space="preserve">L3-goal　MCTS</w:t>
             </w:r>
           </w:p>
@@ -1427,9 +2173,15 @@
           </w:tcPr>
           <w:p>
             <w:pPr>
-              <w:jc w:val="right"/>
-            </w:pPr>
-            <w:r>
+              <w:keepNext/>
+              <w:keepLines/>
+              <w:jc w:val="right"/>
+            </w:pPr>
+            <w:r>
+              <w:rPr>
+                <w:b w:val="false"/>
+                <w:bCs w:val="false"/>
+              </w:rPr>
               <w:t xml:space="preserve">13%</w:t>
             </w:r>
           </w:p>
@@ -1452,9 +2204,15 @@
           </w:tcPr>
           <w:p>
             <w:pPr>
-              <w:jc w:val="right"/>
-            </w:pPr>
-            <w:r>
+              <w:keepNext/>
+              <w:keepLines/>
+              <w:jc w:val="right"/>
+            </w:pPr>
+            <w:r>
+              <w:rPr>
+                <w:b w:val="false"/>
+                <w:bCs w:val="false"/>
+              </w:rPr>
               <w:t xml:space="preserve">0.094</w:t>
             </w:r>
           </w:p>
@@ -1477,9 +2235,15 @@
           </w:tcPr>
           <w:p>
             <w:pPr>
-              <w:jc w:val="right"/>
-            </w:pPr>
-            <w:r>
+              <w:keepNext/>
+              <w:keepLines/>
+              <w:jc w:val="right"/>
+            </w:pPr>
+            <w:r>
+              <w:rPr>
+                <w:b w:val="false"/>
+                <w:bCs w:val="false"/>
+              </w:rPr>
               <w:t xml:space="preserve">≈ 27.4</w:t>
             </w:r>
           </w:p>
@@ -1502,15 +2266,24 @@
           </w:tcPr>
           <w:p>
             <w:pPr>
-              <w:jc w:val="right"/>
-            </w:pPr>
-            <w:r>
+              <w:keepNext/>
+              <w:keepLines/>
+              <w:jc w:val="right"/>
+            </w:pPr>
+            <w:r>
+              <w:rPr>
+                <w:b w:val="false"/>
+                <w:bCs w:val="false"/>
+              </w:rPr>
               <w:t xml:space="preserve">10.2</w:t>
             </w:r>
           </w:p>
         </w:tc>
       </w:tr>
       <w:tr>
+        <w:trPr>
+          <w:cantSplit/>
+        </w:trPr>
         <w:tc>
           <w:tcPr>
             <w:tcW w:type="dxa" w:w="2826"/>
@@ -1529,6 +2302,8 @@
           </w:tcPr>
           <w:p>
             <w:pPr>
+              <w:keepNext w:val="false"/>
+              <w:keepLines/>
               <w:jc w:val="left"/>
             </w:pPr>
             <w:r>
@@ -1558,6 +2333,8 @@
           </w:tcPr>
           <w:p>
             <w:pPr>
+              <w:keepNext w:val="false"/>
+              <w:keepLines/>
               <w:jc w:val="right"/>
             </w:pPr>
             <w:r>
@@ -1587,6 +2364,8 @@
           </w:tcPr>
           <w:p>
             <w:pPr>
+              <w:keepNext w:val="false"/>
+              <w:keepLines/>
               <w:jc w:val="right"/>
             </w:pPr>
             <w:r>
@@ -1616,6 +2395,8 @@
           </w:tcPr>
           <w:p>
             <w:pPr>
+              <w:keepNext w:val="false"/>
+              <w:keepLines/>
               <w:jc w:val="right"/>
             </w:pPr>
             <w:r>
@@ -1645,6 +2426,8 @@
           </w:tcPr>
           <w:p>
             <w:pPr>
+              <w:keepNext w:val="false"/>
+              <w:keepLines/>
               <w:jc w:val="right"/>
             </w:pPr>
             <w:r>
@@ -1758,366 +2541,51 @@
         <w:t xml:space="preserve">前提：Laya 要先訓練</w:t>
       </w:r>
     </w:p>
-    <w:tbl>
-      <w:tblPr>
-        <w:tblW w:type="dxa" w:w="9026"/>
-        <w:tblBorders>
-          <w:top w:val="single" w:color="auto" w:sz="4"/>
-          <w:left w:val="single" w:color="auto" w:sz="4"/>
-          <w:bottom w:val="single" w:color="auto" w:sz="4"/>
-          <w:right w:val="single" w:color="auto" w:sz="4"/>
-          <w:insideH w:val="single" w:color="auto" w:sz="4"/>
-          <w:insideV w:val="single" w:color="auto" w:sz="4"/>
-        </w:tblBorders>
-      </w:tblPr>
-      <w:tblGrid>
-        <w:gridCol w:w="4026"/>
-        <w:gridCol w:w="2500"/>
-        <w:gridCol w:w="2500"/>
-      </w:tblGrid>
-      <w:tr>
-        <w:trPr>
-          <w:tblHeader/>
-        </w:trPr>
-        <w:tc>
-          <w:tcPr>
-            <w:tcW w:type="dxa" w:w="4026"/>
-            <w:tcBorders>
-              <w:top w:val="none" w:color="FFFFFF" w:sz="0"/>
-              <w:left w:val="none" w:color="FFFFFF" w:sz="0"/>
-              <w:bottom w:val="single" w:color="404040" w:sz="8"/>
-              <w:right w:val="none" w:color="FFFFFF" w:sz="0"/>
-            </w:tcBorders>
-            <w:shd w:fill="F2F2F2" w:color="auto" w:val="clear"/>
-            <w:tcMar>
-              <w:top w:type="dxa" w:w="60"/>
-              <w:left w:type="dxa" w:w="100"/>
-              <w:bottom w:type="dxa" w:w="60"/>
-              <w:right w:type="dxa" w:w="100"/>
-            </w:tcMar>
-          </w:tcPr>
-          <w:p>
-            <w:pPr>
-              <w:jc w:val="left"/>
-            </w:pPr>
-            <w:r>
-              <w:rPr>
-                <w:b/>
-                <w:bCs/>
-              </w:rPr>
-              <w:t xml:space="preserve">方法</w:t>
-            </w:r>
-          </w:p>
-        </w:tc>
-        <w:tc>
-          <w:tcPr>
-            <w:tcW w:type="dxa" w:w="2500"/>
-            <w:tcBorders>
-              <w:top w:val="none" w:color="FFFFFF" w:sz="0"/>
-              <w:left w:val="none" w:color="FFFFFF" w:sz="0"/>
-              <w:bottom w:val="single" w:color="404040" w:sz="8"/>
-              <w:right w:val="none" w:color="FFFFFF" w:sz="0"/>
-            </w:tcBorders>
-            <w:shd w:fill="F2F2F2" w:color="auto" w:val="clear"/>
-            <w:tcMar>
-              <w:top w:type="dxa" w:w="60"/>
-              <w:left w:type="dxa" w:w="100"/>
-              <w:bottom w:type="dxa" w:w="60"/>
-              <w:right w:type="dxa" w:w="100"/>
-            </w:tcMar>
-          </w:tcPr>
-          <w:p>
-            <w:pPr>
-              <w:jc w:val="right"/>
-            </w:pPr>
-            <w:r>
-              <w:rPr>
-                <w:b/>
-                <w:bCs/>
-              </w:rPr>
-              <w:t xml:space="preserve">L2-goal 成功率</w:t>
-            </w:r>
-          </w:p>
-        </w:tc>
-        <w:tc>
-          <w:tcPr>
-            <w:tcW w:type="dxa" w:w="2500"/>
-            <w:tcBorders>
-              <w:top w:val="none" w:color="FFFFFF" w:sz="0"/>
-              <w:left w:val="none" w:color="FFFFFF" w:sz="0"/>
-              <w:bottom w:val="single" w:color="404040" w:sz="8"/>
-              <w:right w:val="none" w:color="FFFFFF" w:sz="0"/>
-            </w:tcBorders>
-            <w:shd w:fill="F2F2F2" w:color="auto" w:val="clear"/>
-            <w:tcMar>
-              <w:top w:type="dxa" w:w="60"/>
-              <w:left w:type="dxa" w:w="100"/>
-              <w:bottom w:type="dxa" w:w="60"/>
-              <w:right w:type="dxa" w:w="100"/>
-            </w:tcMar>
-          </w:tcPr>
-          <w:p>
-            <w:pPr>
-              <w:jc w:val="right"/>
-            </w:pPr>
-            <w:r>
-              <w:rPr>
-                <w:b/>
-                <w:bCs/>
-              </w:rPr>
-              <w:t xml:space="preserve">L3-goal 成功率</w:t>
-            </w:r>
-          </w:p>
-        </w:tc>
-      </w:tr>
-      <w:tr>
-        <w:tc>
-          <w:tcPr>
-            <w:tcW w:type="dxa" w:w="4026"/>
-            <w:tcBorders>
-              <w:top w:val="none" w:color="FFFFFF" w:sz="0"/>
-              <w:left w:val="none" w:color="FFFFFF" w:sz="0"/>
-              <w:bottom w:val="single" w:color="BFBFBF" w:sz="4"/>
-              <w:right w:val="none" w:color="FFFFFF" w:sz="0"/>
-            </w:tcBorders>
-            <w:tcMar>
-              <w:top w:type="dxa" w:w="60"/>
-              <w:left w:type="dxa" w:w="100"/>
-              <w:bottom w:type="dxa" w:w="60"/>
-              <w:right w:type="dxa" w:w="100"/>
-            </w:tcMar>
-          </w:tcPr>
-          <w:p>
-            <w:pPr>
-              <w:jc w:val="left"/>
-            </w:pPr>
-            <w:r>
-              <w:t xml:space="preserve">MCTS</w:t>
-            </w:r>
-          </w:p>
-        </w:tc>
-        <w:tc>
-          <w:tcPr>
-            <w:tcW w:type="dxa" w:w="2500"/>
-            <w:tcBorders>
-              <w:top w:val="none" w:color="FFFFFF" w:sz="0"/>
-              <w:left w:val="none" w:color="FFFFFF" w:sz="0"/>
-              <w:bottom w:val="single" w:color="BFBFBF" w:sz="4"/>
-              <w:right w:val="none" w:color="FFFFFF" w:sz="0"/>
-            </w:tcBorders>
-            <w:tcMar>
-              <w:top w:type="dxa" w:w="60"/>
-              <w:left w:type="dxa" w:w="100"/>
-              <w:bottom w:type="dxa" w:w="60"/>
-              <w:right w:type="dxa" w:w="100"/>
-            </w:tcMar>
-          </w:tcPr>
-          <w:p>
-            <w:pPr>
-              <w:jc w:val="right"/>
-            </w:pPr>
-            <w:r>
-              <w:t xml:space="preserve">34%</w:t>
-            </w:r>
-          </w:p>
-        </w:tc>
-        <w:tc>
-          <w:tcPr>
-            <w:tcW w:type="dxa" w:w="2500"/>
-            <w:tcBorders>
-              <w:top w:val="none" w:color="FFFFFF" w:sz="0"/>
-              <w:left w:val="none" w:color="FFFFFF" w:sz="0"/>
-              <w:bottom w:val="single" w:color="BFBFBF" w:sz="4"/>
-              <w:right w:val="none" w:color="FFFFFF" w:sz="0"/>
-            </w:tcBorders>
-            <w:tcMar>
-              <w:top w:type="dxa" w:w="60"/>
-              <w:left w:type="dxa" w:w="100"/>
-              <w:bottom w:type="dxa" w:w="60"/>
-              <w:right w:type="dxa" w:w="100"/>
-            </w:tcMar>
-          </w:tcPr>
-          <w:p>
-            <w:pPr>
-              <w:jc w:val="right"/>
-            </w:pPr>
-            <w:r>
-              <w:t xml:space="preserve">13%</w:t>
-            </w:r>
-          </w:p>
-        </w:tc>
-      </w:tr>
-      <w:tr>
-        <w:tc>
-          <w:tcPr>
-            <w:tcW w:type="dxa" w:w="4026"/>
-            <w:tcBorders>
-              <w:top w:val="none" w:color="FFFFFF" w:sz="0"/>
-              <w:left w:val="none" w:color="FFFFFF" w:sz="0"/>
-              <w:bottom w:val="single" w:color="BFBFBF" w:sz="4"/>
-              <w:right w:val="none" w:color="FFFFFF" w:sz="0"/>
-            </w:tcBorders>
-            <w:tcMar>
-              <w:top w:type="dxa" w:w="60"/>
-              <w:left w:type="dxa" w:w="100"/>
-              <w:bottom w:type="dxa" w:w="60"/>
-              <w:right w:type="dxa" w:w="100"/>
-            </w:tcMar>
-          </w:tcPr>
-          <w:p>
-            <w:pPr>
-              <w:jc w:val="left"/>
-            </w:pPr>
-            <w:r>
-              <w:t xml:space="preserve">Laya（未訓練）+ MCTS</w:t>
-            </w:r>
-          </w:p>
-        </w:tc>
-        <w:tc>
-          <w:tcPr>
-            <w:tcW w:type="dxa" w:w="2500"/>
-            <w:tcBorders>
-              <w:top w:val="none" w:color="FFFFFF" w:sz="0"/>
-              <w:left w:val="none" w:color="FFFFFF" w:sz="0"/>
-              <w:bottom w:val="single" w:color="BFBFBF" w:sz="4"/>
-              <w:right w:val="none" w:color="FFFFFF" w:sz="0"/>
-            </w:tcBorders>
-            <w:tcMar>
-              <w:top w:type="dxa" w:w="60"/>
-              <w:left w:type="dxa" w:w="100"/>
-              <w:bottom w:type="dxa" w:w="60"/>
-              <w:right w:type="dxa" w:w="100"/>
-            </w:tcMar>
-          </w:tcPr>
-          <w:p>
-            <w:pPr>
-              <w:jc w:val="right"/>
-            </w:pPr>
-            <w:r>
-              <w:t xml:space="preserve">19%</w:t>
-            </w:r>
-          </w:p>
-        </w:tc>
-        <w:tc>
-          <w:tcPr>
-            <w:tcW w:type="dxa" w:w="2500"/>
-            <w:tcBorders>
-              <w:top w:val="none" w:color="FFFFFF" w:sz="0"/>
-              <w:left w:val="none" w:color="FFFFFF" w:sz="0"/>
-              <w:bottom w:val="single" w:color="BFBFBF" w:sz="4"/>
-              <w:right w:val="none" w:color="FFFFFF" w:sz="0"/>
-            </w:tcBorders>
-            <w:tcMar>
-              <w:top w:type="dxa" w:w="60"/>
-              <w:left w:type="dxa" w:w="100"/>
-              <w:bottom w:type="dxa" w:w="60"/>
-              <w:right w:type="dxa" w:w="100"/>
-            </w:tcMar>
-          </w:tcPr>
-          <w:p>
-            <w:pPr>
-              <w:jc w:val="right"/>
-            </w:pPr>
-            <w:r>
-              <w:t xml:space="preserve">7%</w:t>
-            </w:r>
-          </w:p>
-        </w:tc>
-      </w:tr>
-      <w:tr>
-        <w:tc>
-          <w:tcPr>
-            <w:tcW w:type="dxa" w:w="4026"/>
-            <w:tcBorders>
-              <w:top w:val="none" w:color="FFFFFF" w:sz="0"/>
-              <w:left w:val="none" w:color="FFFFFF" w:sz="0"/>
-              <w:bottom w:val="single" w:color="BFBFBF" w:sz="4"/>
-              <w:right w:val="none" w:color="FFFFFF" w:sz="0"/>
-            </w:tcBorders>
-            <w:tcMar>
-              <w:top w:type="dxa" w:w="60"/>
-              <w:left w:type="dxa" w:w="100"/>
-              <w:bottom w:type="dxa" w:w="60"/>
-              <w:right w:type="dxa" w:w="100"/>
-            </w:tcMar>
-          </w:tcPr>
-          <w:p>
-            <w:pPr>
-              <w:jc w:val="left"/>
-            </w:pPr>
-            <w:r>
-              <w:rPr>
-                <w:b/>
-                <w:bCs/>
-              </w:rPr>
-              <w:t xml:space="preserve">Laya（訓練後）+ MCTS</w:t>
-            </w:r>
-          </w:p>
-        </w:tc>
-        <w:tc>
-          <w:tcPr>
-            <w:tcW w:type="dxa" w:w="2500"/>
-            <w:tcBorders>
-              <w:top w:val="none" w:color="FFFFFF" w:sz="0"/>
-              <w:left w:val="none" w:color="FFFFFF" w:sz="0"/>
-              <w:bottom w:val="single" w:color="BFBFBF" w:sz="4"/>
-              <w:right w:val="none" w:color="FFFFFF" w:sz="0"/>
-            </w:tcBorders>
-            <w:tcMar>
-              <w:top w:type="dxa" w:w="60"/>
-              <w:left w:type="dxa" w:w="100"/>
-              <w:bottom w:type="dxa" w:w="60"/>
-              <w:right w:type="dxa" w:w="100"/>
-            </w:tcMar>
-          </w:tcPr>
-          <w:p>
-            <w:pPr>
-              <w:jc w:val="right"/>
-            </w:pPr>
-            <w:r>
-              <w:rPr>
-                <w:b/>
-                <w:bCs/>
-              </w:rPr>
-              <w:t xml:space="preserve">94%</w:t>
-            </w:r>
-          </w:p>
-        </w:tc>
-        <w:tc>
-          <w:tcPr>
-            <w:tcW w:type="dxa" w:w="2500"/>
-            <w:tcBorders>
-              <w:top w:val="none" w:color="FFFFFF" w:sz="0"/>
-              <w:left w:val="none" w:color="FFFFFF" w:sz="0"/>
-              <w:bottom w:val="single" w:color="BFBFBF" w:sz="4"/>
-              <w:right w:val="none" w:color="FFFFFF" w:sz="0"/>
-            </w:tcBorders>
-            <w:tcMar>
-              <w:top w:type="dxa" w:w="60"/>
-              <w:left w:type="dxa" w:w="100"/>
-              <w:bottom w:type="dxa" w:w="60"/>
-              <w:right w:type="dxa" w:w="100"/>
-            </w:tcMar>
-          </w:tcPr>
-          <w:p>
-            <w:pPr>
-              <w:jc w:val="right"/>
-            </w:pPr>
-            <w:r>
-              <w:rPr>
-                <w:b/>
-                <w:bCs/>
-              </w:rPr>
-              <w:t xml:space="preserve">89%</w:t>
-            </w:r>
-          </w:p>
-        </w:tc>
-      </w:tr>
-    </w:tbl>
     <w:p>
       <w:pPr>
-        <w:spacing w:after="60"/>
-      </w:pPr>
+        <w:keepNext w:val="false"/>
+        <w:spacing w:after="120" w:before="120" w:line="240" w:lineRule="auto"/>
+      </w:pPr>
+      <w:r>
+        <w:drawing>
+          <wp:inline distT="0" distB="0" distL="0" distR="0">
+            <wp:extent cx="4343400" cy="1914525"/>
+            <wp:effectExtent t="0" r="0" b="0" l="0"/>
+            <wp:docPr id="1" name="Laya 訓練前後的成功率：L2-goal MCTS 34%、未訓練 19%、訓練後 94%；L3-goal 13%、7%、89%" descr="Laya 訓練前後的成功率：L2-goal MCTS 34%、未訓練 19%、訓練後 94%；L3-goal 13%、7%、89%" title="Laya 訓練前後的成功率：L2-goal MCTS 34%、未訓練 19%、訓練後 94%；L3-goal 13%、7%、89%"/>
+            <wp:cNvGraphicFramePr>
+              <a:graphicFrameLocks xmlns:a="http://schemas.openxmlformats.org/drawingml/2006/main" noChangeAspect="1"/>
+            </wp:cNvGraphicFramePr>
+            <a:graphic xmlns:a="http://schemas.openxmlformats.org/drawingml/2006/main">
+              <a:graphicData uri="http://schemas.openxmlformats.org/drawingml/2006/picture">
+                <pic:pic xmlns:pic="http://schemas.openxmlformats.org/drawingml/2006/picture">
+                  <pic:nvPicPr>
+                    <pic:cNvPr id="0" name="" descr=""/>
+                    <pic:cNvPicPr>
+                      <a:picLocks noChangeAspect="1" noChangeArrowheads="1"/>
+                    </pic:cNvPicPr>
+                  </pic:nvPicPr>
+                  <pic:blipFill>
+                    <a:blip r:embed="rId10" cstate="none"/>
+                    <a:srcRect/>
+                    <a:stretch>
+                      <a:fillRect/>
+                    </a:stretch>
+                  </pic:blipFill>
+                  <pic:spPr bwMode="auto">
+                    <a:xfrm>
+                      <a:off x="0" y="0"/>
+                      <a:ext cx="4343400" cy="1914525"/>
+                    </a:xfrm>
+                    <a:prstGeom prst="rect">
+                      <a:avLst/>
+                    </a:prstGeom>
+                  </pic:spPr>
+                </pic:pic>
+              </a:graphicData>
+            </a:graphic>
+          </wp:inline>
+        </w:drawing>
+      </w:r>
     </w:p>
     <w:p>
       <w:pPr>
@@ -2192,6 +2660,8 @@
           </w:tcPr>
           <w:p>
             <w:pPr>
+              <w:keepNext/>
+              <w:keepLines/>
               <w:jc w:val="left"/>
             </w:pPr>
             <w:r>
@@ -2222,6 +2692,8 @@
           </w:tcPr>
           <w:p>
             <w:pPr>
+              <w:keepNext/>
+              <w:keepLines/>
               <w:jc w:val="left"/>
             </w:pPr>
             <w:r>
@@ -2235,6 +2707,9 @@
         </w:tc>
       </w:tr>
       <w:tr>
+        <w:trPr>
+          <w:cantSplit/>
+        </w:trPr>
         <w:tc>
           <w:tcPr>
             <w:tcW w:type="dxa" w:w="2600"/>
@@ -2253,9 +2728,15 @@
           </w:tcPr>
           <w:p>
             <w:pPr>
-              <w:jc w:val="left"/>
-            </w:pPr>
-            <w:r>
+              <w:keepNext/>
+              <w:keepLines/>
+              <w:jc w:val="left"/>
+            </w:pPr>
+            <w:r>
+              <w:rPr>
+                <w:b w:val="false"/>
+                <w:bCs w:val="false"/>
+              </w:rPr>
               <w:t xml:space="preserve">MCTS</w:t>
             </w:r>
           </w:p>
@@ -2278,15 +2759,24 @@
           </w:tcPr>
           <w:p>
             <w:pPr>
-              <w:jc w:val="left"/>
-            </w:pPr>
-            <w:r>
+              <w:keepNext/>
+              <w:keepLines/>
+              <w:jc w:val="left"/>
+            </w:pPr>
+            <w:r>
+              <w:rPr>
+                <w:b w:val="false"/>
+                <w:bCs w:val="false"/>
+              </w:rPr>
               <w:t xml:space="preserve">蒙地卡羅樹搜尋：走每一步前先模擬多種走法，選結果最好的</w:t>
             </w:r>
           </w:p>
         </w:tc>
       </w:tr>
       <w:tr>
+        <w:trPr>
+          <w:cantSplit/>
+        </w:trPr>
         <w:tc>
           <w:tcPr>
             <w:tcW w:type="dxa" w:w="2600"/>
@@ -2305,9 +2795,15 @@
           </w:tcPr>
           <w:p>
             <w:pPr>
-              <w:jc w:val="left"/>
-            </w:pPr>
-            <w:r>
+              <w:keepNext/>
+              <w:keepLines/>
+              <w:jc w:val="left"/>
+            </w:pPr>
+            <w:r>
+              <w:rPr>
+                <w:b w:val="false"/>
+                <w:bCs w:val="false"/>
+              </w:rPr>
               <w:t xml:space="preserve">模擬（simulation）</w:t>
             </w:r>
           </w:p>
@@ -2330,15 +2826,24 @@
           </w:tcPr>
           <w:p>
             <w:pPr>
-              <w:jc w:val="left"/>
-            </w:pPr>
-            <w:r>
+              <w:keepNext/>
+              <w:keepLines/>
+              <w:jc w:val="left"/>
+            </w:pPr>
+            <w:r>
+              <w:rPr>
+                <w:b w:val="false"/>
+                <w:bCs w:val="false"/>
+              </w:rPr>
               <w:t xml:space="preserve">一次在腦中往前試走；本文每步 16 次</w:t>
             </w:r>
           </w:p>
         </w:tc>
       </w:tr>
       <w:tr>
+        <w:trPr>
+          <w:cantSplit/>
+        </w:trPr>
         <w:tc>
           <w:tcPr>
             <w:tcW w:type="dxa" w:w="2600"/>
@@ -2357,9 +2862,15 @@
           </w:tcPr>
           <w:p>
             <w:pPr>
-              <w:jc w:val="left"/>
-            </w:pPr>
-            <w:r>
+              <w:keepNext/>
+              <w:keepLines/>
+              <w:jc w:val="left"/>
+            </w:pPr>
+            <w:r>
+              <w:rPr>
+                <w:b w:val="false"/>
+                <w:bCs w:val="false"/>
+              </w:rPr>
               <w:t xml:space="preserve">rollout</w:t>
             </w:r>
           </w:p>
@@ -2382,15 +2893,24 @@
           </w:tcPr>
           <w:p>
             <w:pPr>
-              <w:jc w:val="left"/>
-            </w:pPr>
-            <w:r>
+              <w:keepNext/>
+              <w:keepLines/>
+              <w:jc w:val="left"/>
+            </w:pPr>
+            <w:r>
+              <w:rPr>
+                <w:b w:val="false"/>
+                <w:bCs w:val="false"/>
+              </w:rPr>
               <w:t xml:space="preserve">從某個局面隨機走到遊戲結束，用成敗當評分</w:t>
             </w:r>
           </w:p>
         </w:tc>
       </w:tr>
       <w:tr>
+        <w:trPr>
+          <w:cantSplit/>
+        </w:trPr>
         <w:tc>
           <w:tcPr>
             <w:tcW w:type="dxa" w:w="2600"/>
@@ -2409,9 +2929,15 @@
           </w:tcPr>
           <w:p>
             <w:pPr>
-              <w:jc w:val="left"/>
-            </w:pPr>
-            <w:r>
+              <w:keepNext/>
+              <w:keepLines/>
+              <w:jc w:val="left"/>
+            </w:pPr>
+            <w:r>
+              <w:rPr>
+                <w:b w:val="false"/>
+                <w:bCs w:val="false"/>
+              </w:rPr>
               <w:t xml:space="preserve">Laya</w:t>
             </w:r>
           </w:p>
@@ -2434,15 +2960,24 @@
           </w:tcPr>
           <w:p>
             <w:pPr>
-              <w:jc w:val="left"/>
-            </w:pPr>
-            <w:r>
+              <w:keepNext/>
+              <w:keepLines/>
+              <w:jc w:val="left"/>
+            </w:pPr>
+            <w:r>
+              <w:rPr>
+                <w:b w:val="false"/>
+                <w:bCs w:val="false"/>
+              </w:rPr>
               <w:t xml:space="preserve">小型決策模型：讀文字，回答選擇題或是非題</w:t>
             </w:r>
           </w:p>
         </w:tc>
       </w:tr>
       <w:tr>
+        <w:trPr>
+          <w:cantSplit/>
+        </w:trPr>
         <w:tc>
           <w:tcPr>
             <w:tcW w:type="dxa" w:w="2600"/>
@@ -2461,9 +2996,15 @@
           </w:tcPr>
           <w:p>
             <w:pPr>
-              <w:jc w:val="left"/>
-            </w:pPr>
-            <w:r>
+              <w:keepNext/>
+              <w:keepLines/>
+              <w:jc w:val="left"/>
+            </w:pPr>
+            <w:r>
+              <w:rPr>
+                <w:b w:val="false"/>
+                <w:bCs w:val="false"/>
+              </w:rPr>
               <w:t xml:space="preserve">policy（策略）</w:t>
             </w:r>
           </w:p>
@@ -2486,15 +3027,24 @@
           </w:tcPr>
           <w:p>
             <w:pPr>
-              <w:jc w:val="left"/>
-            </w:pPr>
-            <w:r>
+              <w:keepNext/>
+              <w:keepLines/>
+              <w:jc w:val="left"/>
+            </w:pPr>
+            <w:r>
+              <w:rPr>
+                <w:b w:val="false"/>
+                <w:bCs w:val="false"/>
+              </w:rPr>
               <w:t xml:space="preserve">Laya 給每個候選動作的機率</w:t>
             </w:r>
           </w:p>
         </w:tc>
       </w:tr>
       <w:tr>
+        <w:trPr>
+          <w:cantSplit/>
+        </w:trPr>
         <w:tc>
           <w:tcPr>
             <w:tcW w:type="dxa" w:w="2600"/>
@@ -2513,9 +3063,15 @@
           </w:tcPr>
           <w:p>
             <w:pPr>
-              <w:jc w:val="left"/>
-            </w:pPr>
-            <w:r>
+              <w:keepNext w:val="false"/>
+              <w:keepLines/>
+              <w:jc w:val="left"/>
+            </w:pPr>
+            <w:r>
+              <w:rPr>
+                <w:b w:val="false"/>
+                <w:bCs w:val="false"/>
+              </w:rPr>
               <w:t xml:space="preserve">value（價值）</w:t>
             </w:r>
           </w:p>
@@ -2538,9 +3094,15 @@
           </w:tcPr>
           <w:p>
             <w:pPr>
-              <w:jc w:val="left"/>
-            </w:pPr>
-            <w:r>
+              <w:keepNext w:val="false"/>
+              <w:keepLines/>
+              <w:jc w:val="left"/>
+            </w:pPr>
+            <w:r>
+              <w:rPr>
+                <w:b w:val="false"/>
+                <w:bCs w:val="false"/>
+              </w:rPr>
               <w:t xml:space="preserve">Laya 估計會不會成功，−1（失敗）到 +1（成功）</w:t>
             </w:r>
           </w:p>
@@ -2773,7 +3335,7 @@
     </w:rPrDefault>
     <w:pPrDefault>
       <w:pPr>
-        <w:spacing w:line="300"/>
+        <w:spacing w:line="300" w:lineRule="auto"/>
       </w:pPr>
     </w:pPrDefault>
   </w:docDefaults>
@@ -2968,6 +3530,7 @@
     <w:next w:val="Normal"/>
     <w:qFormat/>
     <w:pPr>
+      <w:keepNext/>
       <w:spacing w:after="120" w:before="300"/>
       <w:outlineLvl w:val="0"/>
     </w:pPr>

</xml_diff>